<commit_message>
Complete Pod 1 Day 1 documentation
report skeleton with 12 headings, reusable templates (tests/examples/proofs)
</commit_message>
<xml_diff>
--- a/pod1_data_database/day1/Pod1_Day1.docx
+++ b/pod1_data_database/day1/Pod1_Day1.docx
@@ -249,21 +249,15 @@
     <w:p>
       <w:pPr>
         <w:pStyle w:val="Heading3"/>
-        <w:rPr>
-          <w:lang w:val="en-GH"/>
-        </w:rPr>
-      </w:pPr>
-      <w:r>
-        <w:t>Patients</w:t>
+      </w:pPr>
+      <w:r>
+        <w:t>Requests</w:t>
       </w:r>
       <w:r>
         <w:t xml:space="preserve">: </w:t>
       </w:r>
       <w:r>
-        <w:rPr>
-          <w:lang w:val="en-GH"/>
-        </w:rPr>
-        <w:t>Stores information about patients receiving hospital services.</w:t>
+        <w:t>Stores all service requests created within the hospital.</w:t>
       </w:r>
     </w:p>
     <w:p>
@@ -271,7 +265,7 @@
         <w:pStyle w:val="ListBullet"/>
       </w:pPr>
       <w:r>
-        <w:t>PatientID (PK)</w:t>
+        <w:t>id (PK)</w:t>
       </w:r>
     </w:p>
     <w:p>
@@ -279,7 +273,7 @@
         <w:pStyle w:val="ListBullet"/>
       </w:pPr>
       <w:r>
-        <w:t>FirstName</w:t>
+        <w:t>origin_location_id (FK)</w:t>
       </w:r>
     </w:p>
     <w:p>
@@ -287,7 +281,7 @@
         <w:pStyle w:val="ListBullet"/>
       </w:pPr>
       <w:r>
-        <w:t>LastName</w:t>
+        <w:t>destination_location_id (FK)</w:t>
       </w:r>
     </w:p>
     <w:p>
@@ -295,7 +289,7 @@
         <w:pStyle w:val="ListBullet"/>
       </w:pPr>
       <w:r>
-        <w:t>Age</w:t>
+        <w:t>type</w:t>
       </w:r>
     </w:p>
     <w:p>
@@ -303,7 +297,7 @@
         <w:pStyle w:val="ListBullet"/>
       </w:pPr>
       <w:r>
-        <w:t>Gender</w:t>
+        <w:t>urgency_level</w:t>
       </w:r>
     </w:p>
     <w:p>
@@ -311,7 +305,8 @@
         <w:pStyle w:val="ListBullet"/>
       </w:pPr>
       <w:r>
-        <w:t>LocationID (FK)</w:t>
+        <w:lastRenderedPageBreak/>
+        <w:t>status</w:t>
       </w:r>
     </w:p>
     <w:p>
@@ -319,21 +314,27 @@
         <w:pStyle w:val="ListBullet"/>
       </w:pPr>
       <w:r>
-        <w:t>Condition</w:t>
+        <w:t>submitted_time</w:t>
       </w:r>
     </w:p>
     <w:p>
       <w:pPr>
         <w:pStyle w:val="Heading3"/>
-      </w:pPr>
-      <w:r>
-        <w:t>Requests</w:t>
+        <w:rPr>
+          <w:lang w:val="en-GH"/>
+        </w:rPr>
+      </w:pPr>
+      <w:r>
+        <w:t>Resources</w:t>
       </w:r>
       <w:r>
         <w:t xml:space="preserve">: </w:t>
       </w:r>
       <w:r>
-        <w:t>Stores all service requests created within the hospital.</w:t>
+        <w:rPr>
+          <w:lang w:val="en-GH"/>
+        </w:rPr>
+        <w:t>Stores the available staff and equipment used to complete requests.</w:t>
       </w:r>
     </w:p>
     <w:p>
@@ -349,7 +350,7 @@
         <w:pStyle w:val="ListBullet"/>
       </w:pPr>
       <w:r>
-        <w:t>PatientID (FK)</w:t>
+        <w:t>type</w:t>
       </w:r>
     </w:p>
     <w:p>
@@ -357,7 +358,7 @@
         <w:pStyle w:val="ListBullet"/>
       </w:pPr>
       <w:r>
-        <w:t>ResourceID (FK)</w:t>
+        <w:t>availability_status</w:t>
       </w:r>
     </w:p>
     <w:p>
@@ -365,15 +366,27 @@
         <w:pStyle w:val="ListBullet"/>
       </w:pPr>
       <w:r>
-        <w:t>origin_location_id (FK)</w:t>
+        <w:t>current_location_id (FK)</w:t>
       </w:r>
     </w:p>
     <w:p>
       <w:pPr>
-        <w:pStyle w:val="ListBullet"/>
-      </w:pPr>
-      <w:r>
-        <w:t>destination_location_id (FK)</w:t>
+        <w:pStyle w:val="Heading3"/>
+        <w:rPr>
+          <w:lang w:val="en-GH"/>
+        </w:rPr>
+      </w:pPr>
+      <w:r>
+        <w:t>Locations</w:t>
+      </w:r>
+      <w:r>
+        <w:t xml:space="preserve">: </w:t>
+      </w:r>
+      <w:r>
+        <w:rPr>
+          <w:lang w:val="en-GH"/>
+        </w:rPr>
+        <w:t>Stores all departments, wards, and service points in the hospital.</w:t>
       </w:r>
     </w:p>
     <w:p>
@@ -381,7 +394,7 @@
         <w:pStyle w:val="ListBullet"/>
       </w:pPr>
       <w:r>
-        <w:t>type</w:t>
+        <w:t>id (PK)</w:t>
       </w:r>
     </w:p>
     <w:p>
@@ -389,7 +402,7 @@
         <w:pStyle w:val="ListBullet"/>
       </w:pPr>
       <w:r>
-        <w:t>urgency_level</w:t>
+        <w:t>name</w:t>
       </w:r>
     </w:p>
     <w:p>
@@ -397,36 +410,29 @@
         <w:pStyle w:val="ListBullet"/>
       </w:pPr>
       <w:r>
-        <w:lastRenderedPageBreak/>
-        <w:t>status</w:t>
+        <w:t>type (e.g. ward, pharmacy, entrance)</w:t>
       </w:r>
     </w:p>
     <w:p>
       <w:pPr>
-        <w:pStyle w:val="ListBullet"/>
-      </w:pPr>
-      <w:r>
-        <w:t>submitted_time</w:t>
+        <w:pStyle w:val="Heading3"/>
+      </w:pPr>
+      <w:r>
+        <w:t>Roads</w:t>
+      </w:r>
+      <w:r>
+        <w:t xml:space="preserve">: </w:t>
+      </w:r>
+      <w:r>
+        <w:t>Stores the connections between hospital locations for route planning.</w:t>
       </w:r>
     </w:p>
     <w:p>
       <w:pPr>
-        <w:pStyle w:val="Heading3"/>
-        <w:rPr>
-          <w:lang w:val="en-GH"/>
-        </w:rPr>
-      </w:pPr>
-      <w:r>
-        <w:t>Resources</w:t>
-      </w:r>
-      <w:r>
-        <w:t xml:space="preserve">: </w:t>
-      </w:r>
-      <w:r>
-        <w:rPr>
-          <w:lang w:val="en-GH"/>
-        </w:rPr>
-        <w:t>Stores the available staff and equipment used to complete requests.</w:t>
+        <w:pStyle w:val="ListBullet"/>
+      </w:pPr>
+      <w:r>
+        <w:t>id (PK)</w:t>
       </w:r>
     </w:p>
     <w:p>
@@ -434,7 +440,7 @@
         <w:pStyle w:val="ListBullet"/>
       </w:pPr>
       <w:r>
-        <w:t>id (PK)</w:t>
+        <w:t>from_location_id (FK)</w:t>
       </w:r>
     </w:p>
     <w:p>
@@ -442,7 +448,7 @@
         <w:pStyle w:val="ListBullet"/>
       </w:pPr>
       <w:r>
-        <w:t>type</w:t>
+        <w:t>to_location_id (FK)</w:t>
       </w:r>
     </w:p>
     <w:p>
@@ -450,129 +456,7 @@
         <w:pStyle w:val="ListBullet"/>
       </w:pPr>
       <w:r>
-        <w:t>ResourceName</w:t>
-      </w:r>
-    </w:p>
-    <w:p>
-      <w:pPr>
-        <w:pStyle w:val="ListBullet"/>
-      </w:pPr>
-      <w:r>
-        <w:t>availability_status</w:t>
-      </w:r>
-    </w:p>
-    <w:p>
-      <w:pPr>
-        <w:pStyle w:val="ListBullet"/>
-      </w:pPr>
-      <w:r>
-        <w:t>current_location_id (FK)</w:t>
-      </w:r>
-    </w:p>
-    <w:p>
-      <w:pPr>
-        <w:pStyle w:val="Heading3"/>
-        <w:rPr>
-          <w:lang w:val="en-GH"/>
-        </w:rPr>
-      </w:pPr>
-      <w:r>
-        <w:t>Locations</w:t>
-      </w:r>
-      <w:r>
-        <w:t xml:space="preserve">: </w:t>
-      </w:r>
-      <w:r>
-        <w:rPr>
-          <w:lang w:val="en-GH"/>
-        </w:rPr>
-        <w:t>Stores all departments, wards, and service points in the hospital.</w:t>
-      </w:r>
-    </w:p>
-    <w:p>
-      <w:pPr>
-        <w:pStyle w:val="ListBullet"/>
-      </w:pPr>
-      <w:r>
-        <w:t>id (PK)</w:t>
-      </w:r>
-    </w:p>
-    <w:p>
-      <w:pPr>
-        <w:pStyle w:val="ListBullet"/>
-      </w:pPr>
-      <w:r>
-        <w:t>name</w:t>
-      </w:r>
-    </w:p>
-    <w:p>
-      <w:pPr>
-        <w:pStyle w:val="ListBullet"/>
-      </w:pPr>
-      <w:r>
-        <w:t>type (e.g. ward, pharmacy, entrance)</w:t>
-      </w:r>
-    </w:p>
-    <w:p>
-      <w:pPr>
-        <w:pStyle w:val="ListBullet"/>
-      </w:pPr>
-      <w:r>
-        <w:t>Floor</w:t>
-      </w:r>
-    </w:p>
-    <w:p>
-      <w:pPr>
-        <w:pStyle w:val="Heading3"/>
-      </w:pPr>
-      <w:r>
-        <w:t>Roads</w:t>
-      </w:r>
-      <w:r>
-        <w:t xml:space="preserve">: </w:t>
-      </w:r>
-      <w:r>
-        <w:t>Stores the connections between hospital locations for route planning.</w:t>
-      </w:r>
-    </w:p>
-    <w:p>
-      <w:pPr>
-        <w:pStyle w:val="ListBullet"/>
-      </w:pPr>
-      <w:r>
-        <w:t>RoadID (PK)</w:t>
-      </w:r>
-    </w:p>
-    <w:p>
-      <w:pPr>
-        <w:pStyle w:val="ListBullet"/>
-      </w:pPr>
-      <w:r>
-        <w:t>StartLocationID (FK)</w:t>
-      </w:r>
-    </w:p>
-    <w:p>
-      <w:pPr>
-        <w:pStyle w:val="ListBullet"/>
-      </w:pPr>
-      <w:r>
-        <w:t>EndLocationID (FK)</w:t>
-      </w:r>
-    </w:p>
-    <w:p>
-      <w:pPr>
-        <w:pStyle w:val="ListBullet"/>
-      </w:pPr>
-      <w:r>
-        <w:t>Distance</w:t>
-      </w:r>
-    </w:p>
-    <w:p>
-      <w:pPr>
-        <w:pStyle w:val="ListBullet"/>
-      </w:pPr>
-      <w:r>
-        <w:t>EstimatedTime</w:t>
+        <w:t>distance</w:t>
       </w:r>
     </w:p>
     <w:p>
@@ -768,7 +652,7 @@
     </w:p>
     <w:p>
       <w:r>
-        <w:t>The Entity Relationship Diagram (ERD) illustrates the structure of the Hospital Smart Service Operations Optimizer database. It shows the entities, their attributes, and the relationships between them. Field names in the Requests, Locations, and Resources tables have been aligned with the locked schema in Section 3 (e.g. RequestID -&gt; id, RequestType -&gt; type, Priority -&gt; urgency_level, RequestTime -&gt; submitted_time, DestinationLocationID -&gt; destination_location_id), and a new origin_location_id field has been added to Requests so each request records both a starting point and a destination. The diagram serves as the blueprint for the SQLite database and ensures that data is organized efficiently while maintaining referential integrity.</w:t>
+        <w:t>The Entity Relationship Diagram (ERD) illustrates the structure of the Hospital Smart Service Operations Optimizer database. It shows the entities, their attributes, and the relationships between them. Section 4 has been fully aligned with the locked schema in Section 3: the Patients table has been removed (patients are not part of the locked schema), the PatientID and ResourceID foreign keys have been removed from Requests, the Floor field has been removed from Locations, ResourceName has been removed from Resources, and the Roads table's fields have been renamed to match Section 3 exactly (RoadID -&gt; id, StartLocationID -&gt; from_location_id, EndLocationID -&gt; to_location_id, Distance -&gt; distance, with EstimatedTime removed). The diagram serves as the blueprint for the SQLite database and ensures that data is organized efficiently while maintaining referential integrity.</w:t>
       </w:r>
     </w:p>
     <w:p>
@@ -776,51 +660,32 @@
         <w:jc w:val="center"/>
       </w:pPr>
       <w:r>
-        <w:rPr>
-          <w:noProof/>
-        </w:rPr>
         <w:drawing>
-          <wp:inline distT="0" distB="0" distL="0" distR="0" wp14:anchorId="3E116D58" wp14:editId="0788D1A5">
-            <wp:extent cx="5486400" cy="5010150"/>
-            <wp:effectExtent l="0" t="0" r="0" b="0"/>
-            <wp:docPr id="1369978" name="Picture 2"/>
+          <wp:inline xmlns:a="http://schemas.openxmlformats.org/drawingml/2006/main" xmlns:pic="http://schemas.openxmlformats.org/drawingml/2006/picture">
+            <wp:extent cx="5760720" cy="3947788"/>
+            <wp:docPr id="334746801" name="Picture 334746801"/>
             <wp:cNvGraphicFramePr>
-              <a:graphicFrameLocks xmlns:a="http://schemas.openxmlformats.org/drawingml/2006/main" noChangeAspect="1"/>
+              <a:graphicFrameLocks noChangeAspect="1"/>
             </wp:cNvGraphicFramePr>
-            <a:graphic xmlns:a="http://schemas.openxmlformats.org/drawingml/2006/main">
+            <a:graphic>
               <a:graphicData uri="http://schemas.openxmlformats.org/drawingml/2006/picture">
-                <pic:pic xmlns:pic="http://schemas.openxmlformats.org/drawingml/2006/picture">
+                <pic:pic>
                   <pic:nvPicPr>
-                    <pic:cNvPr id="0" name="Picture 6"/>
-                    <pic:cNvPicPr>
-                      <a:picLocks noChangeAspect="1" noChangeArrowheads="1"/>
-                    </pic:cNvPicPr>
+                    <pic:cNvPr id="0" name="ERD_final.jpg"/>
+                    <pic:cNvPicPr/>
                   </pic:nvPicPr>
                   <pic:blipFill>
-                    <a:blip r:embed="rId6">
-                      <a:extLst>
-                        <a:ext uri="{28A0092B-C50C-407E-A947-70E740481C1C}">
-                          <a14:useLocalDpi xmlns:a14="http://schemas.microsoft.com/office/drawing/2010/main" val="0"/>
-                        </a:ext>
-                      </a:extLst>
-                    </a:blip>
-                    <a:srcRect/>
+                    <a:blip r:embed="rId12"/>
                     <a:stretch>
                       <a:fillRect/>
                     </a:stretch>
                   </pic:blipFill>
-                  <pic:spPr bwMode="auto">
+                  <pic:spPr>
                     <a:xfrm>
                       <a:off x="0" y="0"/>
-                      <a:ext cx="5486400" cy="5010150"/>
+                      <a:ext cx="5760720" cy="3947788"/>
                     </a:xfrm>
-                    <a:prstGeom prst="rect">
-                      <a:avLst/>
-                    </a:prstGeom>
-                    <a:noFill/>
-                    <a:ln>
-                      <a:noFill/>
-                    </a:ln>
+                    <a:prstGeom prst="rect"/>
                   </pic:spPr>
                 </pic:pic>
               </a:graphicData>
@@ -848,16 +713,14 @@
     </w:p>
     <w:p>
       <w:r>
-        <w:t>Input: Patient details, request type, priority</w:t>
-      </w:r>
-      <w:r>
+        <w:t>Input: Request type, urgency level, origin and destination location</w:t>
         <w:br/>
         <w:t>Output: Request stored</w:t>
-      </w:r>
-      <w:r>
         <w:br/>
-        <w:t>Possible Error: Missing patient ID</w:t>
-      </w:r>
+        <w:t>Possible Error: Missing required field or invalid location ID</w:t>
+      </w:r>
+      <w:r/>
+      <w:r/>
     </w:p>
     <w:p>
       <w:pPr>
@@ -906,21 +769,19 @@
         <w:pStyle w:val="Heading3"/>
       </w:pPr>
       <w:r>
-        <w:t>Search Hospital Records</w:t>
+        <w:t>Search Requests</w:t>
       </w:r>
     </w:p>
     <w:p>
       <w:r>
-        <w:t>Input: Patient ID or Request ID</w:t>
-      </w:r>
-      <w:r>
+        <w:t>Input: Request ID</w:t>
         <w:br/>
-        <w:t>Output: Matching record</w:t>
-      </w:r>
-      <w:r>
+        <w:t>Output: Matching request record</w:t>
         <w:br/>
         <w:t>Possible Error: Record not found</w:t>
       </w:r>
+      <w:r/>
+      <w:r/>
     </w:p>
     <w:p>
       <w:pPr>
@@ -952,52 +813,36 @@
       </w:r>
     </w:p>
     <w:p>
-      <w:r>
-        <w:rPr>
-          <w:noProof/>
-        </w:rPr>
+      <w:pPr>
+        <w:jc w:val="center"/>
+      </w:pPr>
+      <w:r>
         <w:drawing>
-          <wp:inline distT="0" distB="0" distL="0" distR="0" wp14:anchorId="4A548FF9" wp14:editId="070350D3">
-            <wp:extent cx="5486400" cy="3171825"/>
-            <wp:effectExtent l="0" t="0" r="0" b="9525"/>
-            <wp:docPr id="334746798" name="Picture 2"/>
+          <wp:inline xmlns:a="http://schemas.openxmlformats.org/drawingml/2006/main" xmlns:pic="http://schemas.openxmlformats.org/drawingml/2006/picture">
+            <wp:extent cx="5486400" cy="2307634"/>
+            <wp:docPr id="334746800" name="Picture 334746800"/>
             <wp:cNvGraphicFramePr>
-              <a:graphicFrameLocks xmlns:a="http://schemas.openxmlformats.org/drawingml/2006/main" noChangeAspect="1"/>
+              <a:graphicFrameLocks noChangeAspect="1"/>
             </wp:cNvGraphicFramePr>
-            <a:graphic xmlns:a="http://schemas.openxmlformats.org/drawingml/2006/main">
+            <a:graphic>
               <a:graphicData uri="http://schemas.openxmlformats.org/drawingml/2006/picture">
-                <pic:pic xmlns:pic="http://schemas.openxmlformats.org/drawingml/2006/picture">
+                <pic:pic>
                   <pic:nvPicPr>
-                    <pic:cNvPr id="0" name="Picture 1"/>
-                    <pic:cNvPicPr>
-                      <a:picLocks noChangeAspect="1" noChangeArrowheads="1"/>
-                    </pic:cNvPicPr>
+                    <pic:cNvPr id="0" name="menu_sketch.png"/>
+                    <pic:cNvPicPr/>
                   </pic:nvPicPr>
                   <pic:blipFill>
-                    <a:blip r:embed="rId7">
-                      <a:extLst>
-                        <a:ext uri="{28A0092B-C50C-407E-A947-70E740481C1C}">
-                          <a14:useLocalDpi xmlns:a14="http://schemas.microsoft.com/office/drawing/2010/main" val="0"/>
-                        </a:ext>
-                      </a:extLst>
-                    </a:blip>
-                    <a:srcRect/>
+                    <a:blip r:embed="rId11"/>
                     <a:stretch>
                       <a:fillRect/>
                     </a:stretch>
                   </pic:blipFill>
-                  <pic:spPr bwMode="auto">
+                  <pic:spPr>
                     <a:xfrm>
                       <a:off x="0" y="0"/>
-                      <a:ext cx="5486400" cy="3171825"/>
+                      <a:ext cx="5486400" cy="2307634"/>
                     </a:xfrm>
-                    <a:prstGeom prst="rect">
-                      <a:avLst/>
-                    </a:prstGeom>
-                    <a:noFill/>
-                    <a:ln>
-                      <a:noFill/>
-                    </a:ln>
+                    <a:prstGeom prst="rect"/>
                   </pic:spPr>
                 </pic:pic>
               </a:graphicData>
@@ -2199,7 +2044,7 @@
         <w:rPr>
           <w:lang w:val="en-GH"/>
         </w:rPr>
-        <w:t>Round up to a practical implementation size:</w:t>
+        <w:t>Adjust to the nearest practical implementation size (a power of two, commonly used for hash table sizing):</w:t>
       </w:r>
     </w:p>
     <w:p>

</xml_diff>